<commit_message>
Acta v3: detector descomprometido (hipótesis-lente falsable) + WP1 revisión-con-tesis
- Asociaciones régimen-condicionadas: de mecanismo comprometido a hipótesis-lente falsable,
  puesta a prueba en WP2 frente a todas las familias (semi-supervisado); puede resultar falsa
- WP1 = revisión-con-tesis en 2 capas (mapeo + auditoría con criterios pre-especificados) ->
  dos listas de baselines (referencia / candidatos a re-evaluación)
- WP2 re-evalúa baselines auditados y contrasta la lente (veredicto explícito)
- WP3 condicionado a WP1+WP2, sin prejuzgar su mecanismo
- Interpretabilidad = consecuencia condicionada
- Regenerado Plan_Investigacion_v37.docx; 13/13 comprobaciones v3, 84 refs sin huérfanas, 0 prohibidos

Co-Authored-By: Claude Opus 4.8 <noreply@anthropic.com>
Claude-Session: https://claude.ai/code/session_016PgaULabtzFy6msZQ4CCRq
</commit_message>
<xml_diff>
--- a/Plan_Investigacion_v37.docx
+++ b/Plan_Investigacion_v37.docx
@@ -541,7 +541,7 @@
         <w:jc w:val="both"/>
       </w:pPr>
       <w:r>
-        <w:t xml:space="preserve">Sobre ese diagnóstico, una hipótesis de trabajo propone un mecanismo de detección. El estado operativo de la planta es latente y se manifiesta en asociaciones estables entre las variables medidas; bajo las mismas condiciones exógenas y el mismo régimen, esas asociaciones se mantienen, y su ruptura es un indicador de anomalía más robusto frente a la deriva que el valor individual de cada variable o que una puntuación agregada umbralizada de forma global. Como el criterio de normalidad se condiciona al régimen, la alarma identifica de forma nativa qué asociación y en qué régimen se ha roto: una explicación que describe el evento detectado, sin afirmación causal sobre su origen físico.</w:t>
+        <w:t xml:space="preserve">Sobre ese diagnóstico, una hipótesis de trabajo, formulada como lente falsable y no como un mecanismo de detección comprometido de antemano, conjetura sobre qué propiedad hace robusto a un detector frente a la brecha. El estado operativo de la planta es latente y se manifiesta en asociaciones entre las variables medidas, que dependen del régimen operativo; la conjetura es que la capacidad de capturar esa estructura relacional condicionada al régimen, por encima del seguimiento del valor individual de cada variable o de una puntuación agregada umbralizada de forma global, sería la que confiere robustez frente a la deriva. La lente se pone a prueba en el plano empírico frente a todas las familias de detección en régimen semi-supervisado, y puede resultar falsa, lo que sería un resultado válido; el detector que finalmente se proponga no se prejuzga, sino que se decide a partir de la evidencia. Si la lente se sostuviera, la alarma identificaría de forma nativa qué relación y en qué régimen se ha roto: una explicación que describe el evento detectado, sin afirmación causal sobre su origen físico.</w:t>
       </w:r>
     </w:p>
     <w:p>
@@ -551,7 +551,7 @@
         <w:jc w:val="both"/>
       </w:pPr>
       <w:r>
-        <w:t xml:space="preserve">La validación se realiza sobre los bancos públicos etiquetados, con un panel de métricas sensibles al despliegue (volumen bajo la superficie, métricas de afiliación, F-compuesta por eventos y evaluación bajo presupuesto de alarmas) y con baselines triviales como prueba de cordura. No se afirma reducir la brecha en una planta real concreta: los datos de planta sin etiquetar, procedentes del contexto aplicado del proyecto TrueData en el que ha participado el grupo de investigación GRITA de la Universidad Católica de Murcia (UCAM), carecen de verdad de referencia de ataques y se emplean como evidencia descriptiva del problema (prueba de concepto y trabajo futuro), no como fuente de métricas de detección. La contribución se sitúa en la integración (detección por ruptura de asociaciones condicionada al régimen, protocolo de transferencia entre plantas y evaluación realista de despliegue) aplicada específicamente a las series OT del proceso de agua, más que en cada una de esas piezas por separado.</w:t>
+        <w:t xml:space="preserve">La validación se realiza sobre los bancos públicos etiquetados, con un panel de métricas sensibles al despliegue (volumen bajo la superficie, métricas de afiliación, F-compuesta por eventos y evaluación bajo presupuesto de alarmas) y con baselines triviales como prueba de cordura. No se afirma reducir la brecha en una planta real concreta: los datos de planta sin etiquetar, procedentes del contexto aplicado del proyecto TrueData en el que ha participado el grupo de investigación GRITA de la Universidad Católica de Murcia (UCAM), carecen de verdad de referencia de ataques y se emplean como evidencia descriptiva del problema (prueba de concepto y trabajo futuro), no como fuente de métricas de detección. La contribución se sitúa en la integración (una detección robusta a la brecha, con la estructura relacional condicionada al régimen como hipótesis-lente a validar y no como método fijado de antemano; un protocolo de transferencia entre plantas; y una evaluación realista de despliegue) aplicada específicamente a las series OT del proceso de agua, más que en cada una de esas piezas por separado.</w:t>
       </w:r>
     </w:p>
     <w:p>
@@ -649,10 +649,10 @@
         <w:rPr>
           <w:b/>
         </w:rPr>
-        <w:t xml:space="preserve">Tipificar los factores de la brecha</w:t>
-      </w:r>
-      <w:r>
-        <w:t xml:space="preserve"> mediante una revisión propia acotada a la brecha (no una revisión sistemática exhaustiva), apoyada en las revisiones existentes y con una taxonomía propia, que separe los factores metodológicos de la evaluación de los factores propios de la naturaleza del sistema (WP1, Paper 1).</w:t>
+        <w:t xml:space="preserve">Mapear y auditar críticamente la detección semi-supervisada del estado del arte</w:t>
+      </w:r>
+      <w:r>
+        <w:t xml:space="preserve"> mediante una revisión propia acotada a la brecha y con tesis (no una revisión sistemática exhaustiva ni un catálogo descriptivo): cartografiar los mejores detectores por familias para las series OT de agua y auditar la calidad de su evaluación con criterios pre-especificados, produciendo una taxonomía de la brecha y dos listas de baselines, los bien evaluados (referencia) y los reputados pero mal evaluados (candidatos a re-evaluación) (WP1, Paper 1).</w:t>
       </w:r>
     </w:p>
     <w:p>
@@ -671,7 +671,7 @@
         <w:t xml:space="preserve">Cuantificar el efecto observado de cada factor</w:t>
       </w:r>
       <w:r>
-        <w:t xml:space="preserve"> sobre el rendimiento en un diseño experimental controlado sobre los bancos públicos, y derivar de ahí un protocolo de evaluación realista de despliegue (WP2, Paper 2).</w:t>
+        <w:t xml:space="preserve"> sobre el rendimiento en un diseño experimental controlado, re-evaluar honestamente los baselines (incluida la lista de candidatos) bajo el panel de métricas y bajo cambios de régimen y de banco de pruebas, y poner a prueba la hipótesis-lente frente a las familias de detección; de ahí se deriva un protocolo de evaluación realista de despliegue (WP2, Paper 2).</w:t>
       </w:r>
     </w:p>
     <w:p>
@@ -687,10 +687,10 @@
         <w:rPr>
           <w:b/>
         </w:rPr>
-        <w:t xml:space="preserve">Diseñar y evaluar un detector por ruptura de asociaciones condicionado al régimen operativo</w:t>
-      </w:r>
-      <w:r>
-        <w:t xml:space="preserve">, y contrastar su robustez frente a la deriva contra baselines, sin recurrir a la selección de umbral con oráculo, con la interpretabilidad como consecuencia del mecanismo (WP3, Paper 3).</w:t>
+        <w:t xml:space="preserve">Diseñar y evaluar una propuesta de detección a partir de la evidencia de los objetivos anteriores</w:t>
+      </w:r>
+      <w:r>
+        <w:t xml:space="preserve">, sin prejuzgar su mecanismo, contrastando su robustez frente a la deriva contra los baselines auditados, sin recurrir a la selección de umbral con oráculo, con la interpretabilidad como consecuencia si la hipótesis-lente se hubiera sostenido (WP3, Paper 3).</w:t>
       </w:r>
     </w:p>
     <w:p>
@@ -748,10 +748,10 @@
         <w:rPr>
           <w:b/>
         </w:rPr>
-        <w:t xml:space="preserve">Hipótesis de trabajo (mecanismo, nivel artículo).</w:t>
-      </w:r>
-      <w:r>
-        <w:t xml:space="preserve"> El estado operativo de la planta es latente y se manifiesta en asociaciones estables entre las variables medidas. </w:t>
+        <w:t xml:space="preserve">Hipótesis de trabajo (hipótesis-lente falsable, nivel artículo).</w:t>
+      </w:r>
+      <w:r>
+        <w:t xml:space="preserve"> El estado operativo de la planta es latente y se manifiesta en asociaciones entre las variables medidas. </w:t>
       </w:r>
       <w:r>
         <w:rPr>
@@ -760,16 +760,25 @@
         <w:t xml:space="preserve">(a) Contexto:</w:t>
       </w:r>
       <w:r>
-        <w:t xml:space="preserve"> esas asociaciones dependen del régimen operativo, por lo que el criterio de normalidad debe condicionarse al régimen y no aplicarse de forma global. </w:t>
+        <w:t xml:space="preserve"> esas asociaciones dependen del régimen operativo, por lo que un criterio de normalidad condicionado al régimen debería ser más robusto a la brecha que uno global. </w:t>
       </w:r>
       <w:r>
         <w:rPr>
           <w:i/>
         </w:rPr>
-        <w:t xml:space="preserve">(b) Mecanismo:</w:t>
-      </w:r>
-      <w:r>
-        <w:t xml:space="preserve"> bajo las mismas condiciones exógenas y el mismo régimen, la evolución de las variables endógenas preserva esas asociaciones; su ruptura es un indicador de anomalía más robusto frente a la deriva que el valor individual de cada variable o que una puntuación agregada umbralizada de forma global. Esta hipótesis gobierna el plano de propuesta (WP3).</w:t>
+        <w:t xml:space="preserve">(b) Conjetura de mecanismo:</w:t>
+      </w:r>
+      <w:r>
+        <w:t xml:space="preserve"> bajo las mismas condiciones exógenas y el mismo régimen, la evolución de las variables endógenas preserva asociaciones estables, y la propiedad de capturar esa estructura relacional condicionada al régimen sería la que confiere robustez frente a la deriva, por encima del seguimiento del valor individual de cada variable o de una puntuación agregada umbralizada de forma global. Se formula deliberadamente como </w:t>
+      </w:r>
+      <w:r>
+        <w:rPr>
+          <w:b/>
+        </w:rPr>
+        <w:t xml:space="preserve">hipótesis-lente sobre la propiedad deseable, no como compromiso con una familia de modelos concreta</w:t>
+      </w:r>
+      <w:r>
+        <w:t xml:space="preserve">: se pone a prueba en WP2 frente a todas las familias (reconstrucción, predicción, probabilísticos, grafos, invariantes, espacio de estados), en régimen semi-supervisado, y puede resultar falsa, lo que sería un resultado válido y no un fracaso. El detector concreto de WP3 no se prejuzga: se decide con la evidencia de WP1 y WP2.</w:t>
       </w:r>
     </w:p>
     <w:p>
@@ -782,10 +791,10 @@
         <w:rPr>
           <w:b/>
         </w:rPr>
-        <w:t xml:space="preserve">Interpretabilidad (consecuencia, no hipótesis).</w:t>
-      </w:r>
-      <w:r>
-        <w:t xml:space="preserve"> Si la detección opera por ruptura de asociaciones condicionada al régimen, la alarma identifica qué asociación y en qué régimen se ha roto: una explicación nativa del disparo, que describe el evento detectado sin afirmar nada sobre su causa física. La cautela es deliberada y tiene respaldo: la evidencia reciente muestra que la atribución de una alarma a variables concretas resulta inexacta justamente donde se la suponía fiable, en los actuadores categóricos (Fung et al., 2024), de modo que la explicación se entiende aquí como descripción de qué asociación se rompió, no como identificación de la causa.</w:t>
+        <w:t xml:space="preserve">Interpretabilidad (consecuencia condicionada, no hipótesis).</w:t>
+      </w:r>
+      <w:r>
+        <w:t xml:space="preserve"> Si la detección acabara operando por estructura relacional condicionada al régimen (un resultado de WP2 y WP3, no un supuesto), la alarma identificaría qué relación y en qué régimen se ha roto: una explicación nativa del disparo, que describe el evento detectado sin afirmar nada sobre su causa física. La cautela es deliberada y tiene respaldo: la evidencia reciente muestra que la atribución de una alarma a variables concretas resulta inexacta justamente donde se la suponía fiable, en los actuadores categóricos (Fung et al., 2024), de modo que la explicación se entiende aquí como descripción de qué asociación se rompió, no como identificación de la causa.</w:t>
       </w:r>
     </w:p>
     <w:p>
@@ -801,7 +810,7 @@
         <w:t xml:space="preserve">Delimitación (lo que no se afirma).</w:t>
       </w:r>
       <w:r>
-        <w:t xml:space="preserve"> No se afirma reducir la brecha en una planta real concreta. Los datos de planta disponibles carecen de verdad de referencia de ataques y no permiten métricas de detección; se usan como evidencia descriptiva del problema (prueba de concepto y trabajo futuro). Conviene distinguir dos planos que la literatura suele colapsar: la representación del contexto (el estado del proceso inferido de los datos) sí aporta información y alimenta el criterio de detección; la operacionalización de la decisión (reglas, restricciones, costes y utilidad) no es información observacional, sino el gobierno de la alarma. Las dos hipótesis son, además, excluyentes en lo que afirman: caracterizar la composición de la brecha (central) y proponer un mecanismo de detección condicionado al régimen (trabajo) pueden resultar ciertas o falsas de forma independiente, sin que una determine a la otra.</w:t>
+        <w:t xml:space="preserve"> No se afirma reducir la brecha en una planta real concreta. Los datos de planta disponibles carecen de verdad de referencia de ataques y no permiten métricas de detección; se usan como evidencia descriptiva del problema (prueba de concepto y trabajo futuro). Conviene distinguir dos planos que la literatura suele colapsar: la representación del contexto (el estado del proceso inferido de los datos) sí aporta información y alimenta el criterio de detección; la operacionalización de la decisión (reglas, restricciones, costes y utilidad) no es información observacional, sino el gobierno de la alarma. Las dos hipótesis son, además, excluyentes en lo que afirman: caracterizar la composición de la brecha (central) y conjeturar qué propiedad confiere robustez a un detector (trabajo, hipótesis-lente) pueden resultar ciertas o falsas de forma independiente, sin que una determine a la otra. La central gobierna el plano de diagnóstico (WP1 y WP2); la lente se pone a prueba en WP2 y, solo si se sostiene, fundamenta la propuesta de WP3, cuyo detector no se prejuzga.</w:t>
       </w:r>
     </w:p>
     <w:p>
@@ -817,7 +826,7 @@
         <w:t xml:space="preserve">Criterio de decisión.</w:t>
       </w:r>
       <w:r>
-        <w:t xml:space="preserve"> Si, al evaluar el mecanismo propuesto con el panel de métricas realistas de despliegue, su ventaja sobre los baselines triviales desaparece tras un cambio de régimen o de banco de pruebas, el programa se reorienta hacia la robustez frente a la deriva y la transferibilidad antes que hacia la exactitud puntual; si la ventaja persiste bajo presupuesto de alarmas y bajo transferencia entre plantas, ese es el resultado publicable central.</w:t>
+        <w:t xml:space="preserve"> Si, al evaluar la propuesta resultante con el panel de métricas realistas de despliegue, su ventaja sobre los baselines triviales desaparece tras un cambio de régimen o de banco de pruebas, el programa se reorienta hacia la robustez frente a la deriva y la transferibilidad antes que hacia la exactitud puntual; si la ventaja persiste bajo presupuesto de alarmas y bajo transferencia entre plantas, ese es el resultado publicable central.</w:t>
       </w:r>
     </w:p>
     <w:p>
@@ -1380,10 +1389,10 @@
         <w:rPr>
           <w:b/>
         </w:rPr>
-        <w:t xml:space="preserve">consecuencia</w:t>
-      </w:r>
-      <w:r>
-        <w:t xml:space="preserve"> del mecanismo de detección: si la alarma se dispara por la ruptura de una asociación condicionada al régimen, identifica de forma nativa qué asociación y en qué régimen se ha roto.</w:t>
+        <w:t xml:space="preserve">consecuencia condicionada</w:t>
+      </w:r>
+      <w:r>
+        <w:t xml:space="preserve">: si la detección acabara operando por estructura relacional condicionada al régimen (algo que el programa pone a prueba en WP2 y WP3, no que asume de antemano), la alarma identificaría de forma nativa qué relación y en qué régimen se ha roto.</w:t>
       </w:r>
     </w:p>
     <w:p>
@@ -1695,10 +1704,19 @@
         <w:rPr>
           <w:b/>
         </w:rPr>
-        <w:t xml:space="preserve">Familias comparadas.</w:t>
-      </w:r>
-      <w:r>
-        <w:t xml:space="preserve"> Se comparan en igualdad de condiciones baselines clásicos como Isolation Forest (Liu et al., 2008), modelos de predicción basados en LSTM y </w:t>
+        <w:t xml:space="preserve">Familias comparadas y selección de baselines.</w:t>
+      </w:r>
+      <w:r>
+        <w:t xml:space="preserve"> Los baselines no se heredan en crudo de lo que la literatura considera «mejor», porque ese juicio está sesgado por la evaluación defectuosa que el propio WP1 documenta: compararse contra ellos sin filtrar sería compararse contra un artefacto. Se heredan </w:t>
+      </w:r>
+      <w:r>
+        <w:rPr>
+          <w:b/>
+        </w:rPr>
+        <w:t xml:space="preserve">filtrados por la auditoría de WP1</w:t>
+      </w:r>
+      <w:r>
+        <w:t xml:space="preserve"> en dos listas: los buenos y bien evaluados, como referencia directa, y los reputados pero mal evaluados, cuya re-evaluación honesta es en sí una contribución de WP2. Sobre esa base se comparan en igualdad de condiciones, y en régimen semi-supervisado, las distintas familias: baselines clásicos como Isolation Forest (Liu et al., 2008), modelos de predicción basados en LSTM y </w:t>
       </w:r>
       <w:r>
         <w:rPr>
@@ -1707,7 +1725,7 @@
         <w:t xml:space="preserve">Transformers</w:t>
       </w:r>
       <w:r>
-        <w:t xml:space="preserve"> (Sutskever et al., 2014; Vaswani et al., 2017), de reconstrucción (Audibert et al., 2020; Su et al., 2019; Tuli et al., 2022), de grafos (Chen et al., 2021; Deng &amp; Hooi, 2021; Zhao et al., 2020) y de reglas invariantes (Feng et al., 2019; Umer et al., 2020; Raman &amp; Mathur, 2022a), de modo que se cubran los distintos sesgos inductivos con que cada familia modela la normalidad.</w:t>
+        <w:t xml:space="preserve"> (Sutskever et al., 2014; Vaswani et al., 2017), de reconstrucción (Audibert et al., 2020; Su et al., 2019; Tuli et al., 2022), de grafos (Chen et al., 2021; Deng &amp; Hooi, 2021; Zhao et al., 2020), de reglas invariantes (Feng et al., 2019; Umer et al., 2020; Raman &amp; Mathur, 2022a) y de espacio de estados (Wei et al., 2024), de modo que se cubran los distintos sesgos inductivos con que cada familia modela la normalidad y se pueda contrastar la hipótesis-lente sin estrechar el espacio de métodos a priori.</w:t>
       </w:r>
     </w:p>
     <w:p>
@@ -1807,28 +1825,73 @@
         <w:rPr>
           <w:b/>
         </w:rPr>
-        <w:t xml:space="preserve">WP1 — Diagnóstico teórico (Paper 1).</w:t>
-      </w:r>
-      <w:r>
-        <w:t xml:space="preserve"> Revisión propia </w:t>
+        <w:t xml:space="preserve">WP1 — Revisión-con-tesis y auditoría de baselines (Paper 1).</w:t>
+      </w:r>
+      <w:r>
+        <w:t xml:space="preserve"> Una revisión propia </w:t>
       </w:r>
       <w:r>
         <w:rPr>
           <w:b/>
         </w:rPr>
-        <w:t xml:space="preserve">acotada a la brecha</w:t>
-      </w:r>
-      <w:r>
-        <w:t xml:space="preserve"> (no una revisión sistemática exhaustiva), que se apoya en las revisiones existentes y aporta una taxonomía propia de los factores que separan el rendimiento en banco de pruebas de la utilidad operativa. Hipótesis central en su plano teórico. Salida: </w:t>
+        <w:t xml:space="preserve">acotada a la brecha y con tesis</w:t>
+      </w:r>
+      <w:r>
+        <w:t xml:space="preserve"> (no una revisión sistemática exhaustiva ni un catálogo descriptivo), en dos capas: (i) un </w:t>
+      </w:r>
+      <w:r>
+        <w:rPr>
+          <w:b/>
+        </w:rPr>
+        <w:t xml:space="preserve">mapeo</w:t>
+      </w:r>
+      <w:r>
+        <w:t xml:space="preserve"> de los mejores detectores en régimen </w:t>
+      </w:r>
+      <w:r>
+        <w:rPr>
+          <w:b/>
+        </w:rPr>
+        <w:t xml:space="preserve">semi-supervisado</w:t>
+      </w:r>
+      <w:r>
+        <w:t xml:space="preserve"> para las series OT de agua, organizado por familias; y (ii) una </w:t>
+      </w:r>
+      <w:r>
+        <w:rPr>
+          <w:b/>
+        </w:rPr>
+        <w:t xml:space="preserve">auditoría crítica</w:t>
+      </w:r>
+      <w:r>
+        <w:t xml:space="preserve"> de la calidad de su evaluación (ajuste por puntos, selección de umbral con oráculo, número y diversidad de datasets, condiciones reportadas), con </w:t>
+      </w:r>
+      <w:r>
+        <w:rPr>
+          <w:b/>
+        </w:rPr>
+        <w:t xml:space="preserve">criterios pre-especificados</w:t>
+      </w:r>
+      <w:r>
+        <w:t xml:space="preserve"> de «bien evaluado» fijados antes de aplicarlos. Hipótesis central en su plano teórico. Salida: </w:t>
       </w:r>
       <w:r>
         <w:rPr>
           <w:i/>
         </w:rPr>
-        <w:t xml:space="preserve">Paper 1 — revisión acotada a la brecha</w:t>
-      </w:r>
-      <w:r>
-        <w:t xml:space="preserve">; cierre: taxonomía de la brecha y de sus huecos.</w:t>
+        <w:t xml:space="preserve">Paper 1 — revisión acotada a la brecha, con tesis</w:t>
+      </w:r>
+      <w:r>
+        <w:t xml:space="preserve">; cierre: una taxonomía de la brecha y </w:t>
+      </w:r>
+      <w:r>
+        <w:rPr>
+          <w:b/>
+        </w:rPr>
+        <w:t xml:space="preserve">dos listas de baselines</w:t>
+      </w:r>
+      <w:r>
+        <w:t xml:space="preserve">, los buenos y bien evaluados (referencia directa) y los reputados pero mal evaluados (candidatos a re-evaluación en WP2). Compararse contra el «mejor» heredado sin filtrar sería compararse contra un artefacto de evaluación; de ahí el valor de la auditoría.</w:t>
       </w:r>
     </w:p>
     <w:p>
@@ -1841,10 +1904,28 @@
         <w:rPr>
           <w:b/>
         </w:rPr>
-        <w:t xml:space="preserve">WP2 — Diagnóstico empírico (Paper 2).</w:t>
-      </w:r>
-      <w:r>
-        <w:t xml:space="preserve"> Cuantifica el efecto observado de cada factor sobre el rendimiento en el diseño controlado de la sección 4.1, sobre los bancos públicos. Hipótesis central en su plano empírico. Salida: </w:t>
+        <w:t xml:space="preserve">WP2 — Diagnóstico empírico y prueba de la lente (Paper 2).</w:t>
+      </w:r>
+      <w:r>
+        <w:t xml:space="preserve"> Cuantifica el efecto observado de cada factor sobre el rendimiento en el diseño controlado de la sección 4.1; </w:t>
+      </w:r>
+      <w:r>
+        <w:rPr>
+          <w:b/>
+        </w:rPr>
+        <w:t xml:space="preserve">re-evalúa honestamente los baselines auditados</w:t>
+      </w:r>
+      <w:r>
+        <w:t xml:space="preserve"> (incluida la lista de candidatos) bajo el panel de métricas y bajo cambios de régimen y de banco de pruebas; y </w:t>
+      </w:r>
+      <w:r>
+        <w:rPr>
+          <w:b/>
+        </w:rPr>
+        <w:t xml:space="preserve">pone a prueba la hipótesis-lente</w:t>
+      </w:r>
+      <w:r>
+        <w:t xml:space="preserve"> frente a las familias de detección (¿los detectores que mejor resisten la brecha son los que capturan estructura relacional condicionada al régimen?). Hipótesis central en su plano empírico, más el contraste de la lente. Salida: </w:t>
       </w:r>
       <w:r>
         <w:rPr>
@@ -1853,7 +1934,16 @@
         <w:t xml:space="preserve">Paper 2 — caracterización experimental</w:t>
       </w:r>
       <w:r>
-        <w:t xml:space="preserve">; cierre: magnitud de cada efecto y un protocolo de evaluación realista de despliegue derivado de él.</w:t>
+        <w:t xml:space="preserve">; cierre: la magnitud de cada efecto, un protocolo de evaluación realista de despliegue, y un </w:t>
+      </w:r>
+      <w:r>
+        <w:rPr>
+          <w:b/>
+        </w:rPr>
+        <w:t xml:space="preserve">veredicto sobre la lente</w:t>
+      </w:r>
+      <w:r>
+        <w:t xml:space="preserve"> (que puede ser negativo).</w:t>
       </w:r>
     </w:p>
     <w:p>
@@ -1866,10 +1956,19 @@
         <w:rPr>
           <w:b/>
         </w:rPr>
-        <w:t xml:space="preserve">WP3 — Propuesta (Paper 3).</w:t>
-      </w:r>
-      <w:r>
-        <w:t xml:space="preserve"> Diseña y evalúa un detector por ruptura de asociaciones condicionado al régimen, usando el protocolo de WP2. Hipótesis de trabajo. Salida: </w:t>
+        <w:t xml:space="preserve">WP3 — Propuesta (Paper 3), condicionada a la evidencia.</w:t>
+      </w:r>
+      <w:r>
+        <w:t xml:space="preserve"> Diseña y evalúa una propuesta de detección </w:t>
+      </w:r>
+      <w:r>
+        <w:rPr>
+          <w:b/>
+        </w:rPr>
+        <w:t xml:space="preserve">a partir de los resultados de WP1 y WP2</w:t>
+      </w:r>
+      <w:r>
+        <w:t xml:space="preserve">, sin prejuzgar su mecanismo: si la lente se sostuvo, la propuesta explota la estructura relacional condicionada al régimen; si no, se reorienta hacia la robustez frente a la deriva y la transferibilidad (sección 2.2, criterio de decisión). Salida: </w:t>
       </w:r>
       <w:r>
         <w:rPr>
@@ -1878,7 +1977,7 @@
         <w:t xml:space="preserve">Paper 3 — propuesta metodológica</w:t>
       </w:r>
       <w:r>
-        <w:t xml:space="preserve">; cierre: robustez frente a la deriva contra baselines, sin selección de umbral con oráculo, con interpretabilidad emergente del mecanismo.</w:t>
+        <w:t xml:space="preserve">; cierre: robustez frente a la deriva contra los baselines auditados, sin selección de umbral con oráculo, con interpretabilidad emergente si la lente se hubiera sostenido.</w:t>
       </w:r>
     </w:p>
     <w:p>
@@ -3532,7 +3631,7 @@
                 <w:sz w:val="16"/>
                 <w:szCs w:val="16"/>
               </w:rPr>
-              <w:t>WP1: Diagnóstico teórico — revisión acotada (Paper 1)</w:t>
+              <w:t>WP1: Revisión-con-tesis y auditoría de baselines (Paper 1)</w:t>
             </w:r>
           </w:p>
         </w:tc>
@@ -3836,7 +3935,7 @@
                 <w:sz w:val="16"/>
                 <w:szCs w:val="16"/>
               </w:rPr>
-              <w:t>WP2: Diagnóstico empírico — caracterización (Paper 2)</w:t>
+              <w:t>WP2: Diagnóstico empírico y prueba de la lente (Paper 2)</w:t>
             </w:r>
           </w:p>
         </w:tc>
@@ -4142,7 +4241,7 @@
                 <w:sz w:val="16"/>
                 <w:szCs w:val="16"/>
               </w:rPr>
-              <w:t>WP3: Propuesta — detector régimen-condicionado (Paper 3)</w:t>
+              <w:t>WP3: Propuesta condicionada a la evidencia (Paper 3)</w:t>
             </w:r>
           </w:p>
         </w:tc>
@@ -6309,7 +6408,7 @@
         <w:jc w:val="both"/>
       </w:pPr>
       <w:r>
-        <w:t xml:space="preserve">La tesis se sitúa, por tanto, en la integración de tres elementos que la literatura aborda por separado: (i) la detección por ruptura de asociaciones condicionada al régimen, (ii) un protocolo de transferencia entre plantas y (iii) una evaluación realista de despliegue, aplicados específicamente a las series OT del proceso de agua. El contexto operativo explícito (el modelo de información y el papel de la ontología) es el hilo que conecta la detección con la transferencia, y es precisamente donde el estado del arte está más vacío para el dominio hídrico: un hueco real, de respaldo todavía débil, que el trabajo aborda con prudencia como aportación del hilo teórico.</w:t>
+        <w:t xml:space="preserve">La tesis se sitúa, por tanto, en la integración de tres elementos que la literatura aborda por separado: (i) una detección robusta a la brecha, con la estructura relacional condicionada al régimen como hipótesis-lente a validar y no como método fijado de antemano, (ii) un protocolo de transferencia entre plantas y (iii) una evaluación realista de despliegue, aplicados específicamente a las series OT del proceso de agua. El contexto operativo explícito (el modelo de información y el papel de la ontología) es el hilo que conecta la detección con la transferencia, y es precisamente donde el estado del arte está más vacío para el dominio hídrico: un hueco real, de respaldo todavía débil, que el trabajo aborda con prudencia como aportación del hilo teórico.</w:t>
       </w:r>
     </w:p>
     <w:p>
@@ -6367,7 +6466,7 @@
         <w:jc w:val="both"/>
       </w:pPr>
       <w:r>
-        <w:t xml:space="preserve">En segundo lugar, un conjunto de principios de diseño que el programa busca validar empíricamente: la separación sistemática de lo que la literatura suele colapsar (el modelo frente al criterio de decisión, las variables discretas frente a las continuas, la rareza estadística frente a la consecuencia operativa). El interés metodológico de esta formulación no depende de qué fracción resulte atribuida a cada factor; ahora bien, si la ventaja del mecanismo propuesto sobre los baselines triviales no se sostiene tras un cambio de régimen o de banco de pruebas, el programa se reorienta hacia la robustez y la transferibilidad, según el criterio de corte declarado en la sección 2.2. La detección fiable, la robustez frente a la deriva, la explicabilidad y la estructuración del contexto se mantienen como dimensiones del estudio, subordinadas a la pregunta y no planteadas como frentes paralelos.</w:t>
+        <w:t xml:space="preserve">En segundo lugar, un conjunto de principios de diseño que el programa busca validar empíricamente: la separación sistemática de lo que la literatura suele colapsar (el modelo frente al criterio de decisión, las variables discretas frente a las continuas, la rareza estadística frente a la consecuencia operativa). El interés metodológico de esta formulación no depende de qué fracción resulte atribuida a cada factor; ahora bien, si la ventaja de la propuesta resultante sobre los baselines triviales no se sostiene tras un cambio de régimen o de banco de pruebas, el programa se reorienta hacia la robustez y la transferibilidad, según el criterio de corte declarado en la sección 2.2. La detección fiable, la robustez frente a la deriva, la explicabilidad y la estructuración del contexto se mantienen como dimensiones del estudio, subordinadas a la pregunta y no planteadas como frentes paralelos.</w:t>
       </w:r>
     </w:p>
     <w:p>

</xml_diff>